<commit_message>
Updating the Logic to ensure that objects selected ruing some operations are deselected before the add-on does anything, may need more bug testing. Alos updated the notes for the add - on
</commit_message>
<xml_diff>
--- a/Notes for blender Cartoon faces add on.docx
+++ b/Notes for blender Cartoon faces add on.docx
@@ -4,6 +4,69 @@
   <w:body>
     <w:p>
       <w:r>
+        <w:t>Demos:</w:t>
+      </w:r>
+    </w:p>
+    <w:p>
+      <w:r>
+        <w:t xml:space="preserve">Attaboy main drawing demo – on </w:t>
+      </w:r>
+      <w:proofErr w:type="spellStart"/>
+      <w:r>
+        <w:t>youtube</w:t>
+      </w:r>
+      <w:proofErr w:type="spellEnd"/>
+    </w:p>
+    <w:p>
+      <w:r>
+        <w:t>Character demos:</w:t>
+      </w:r>
+    </w:p>
+    <w:p>
+      <w:r>
+        <w:t>3d:</w:t>
+      </w:r>
+    </w:p>
+    <w:p>
+      <w:r>
+        <w:t>Sonic</w:t>
+      </w:r>
+    </w:p>
+    <w:p>
+      <w:r>
+        <w:t>Anime Man</w:t>
+      </w:r>
+    </w:p>
+    <w:p>
+      <w:r>
+        <w:t>Anime woman</w:t>
+      </w:r>
+    </w:p>
+    <w:p/>
+    <w:p>
+      <w:r>
+        <w:t>2D:</w:t>
+      </w:r>
+    </w:p>
+    <w:p>
+      <w:r>
+        <w:t>Western animation</w:t>
+      </w:r>
+    </w:p>
+    <w:p>
+      <w:r>
+        <w:t>Hilda?</w:t>
+      </w:r>
+    </w:p>
+    <w:p>
+      <w:r>
+        <w:t>Anime</w:t>
+      </w:r>
+    </w:p>
+    <w:p/>
+    <w:p/>
+    <w:p>
+      <w:r>
         <w:t xml:space="preserve">First steps: </w:t>
       </w:r>
     </w:p>
@@ -90,6 +153,7 @@
     </w:p>
     <w:p>
       <w:r>
+        <w:lastRenderedPageBreak/>
         <w:t>Offset?</w:t>
       </w:r>
     </w:p>
@@ -173,11 +237,7 @@
         <w:t xml:space="preserve">Eye brows use sliders. Button will prompt user if they are finished with this shape. </w:t>
       </w:r>
       <w:r>
-        <w:t xml:space="preserve">When drawing, you can use as many layers as possible, and they will be put all on one layer by using the order of layers to determine order of strokes (will send everything to back based on order) OR will attach that driver to all current layers- does this correctly by LOCKING previous </w:t>
-      </w:r>
-      <w:r>
-        <w:lastRenderedPageBreak/>
-        <w:t xml:space="preserve">layers. (if locked, ignore) </w:t>
+        <w:t xml:space="preserve">When drawing, you can use as many layers as possible, and they will be put all on one layer by using the order of layers to determine order of strokes (will send everything to back based on order) OR will attach that driver to all current layers- does this correctly by LOCKING previous layers. (if locked, ignore) </w:t>
       </w:r>
       <w:r>
         <w:t>Everything drawn is automatically added to vertex groups and a separate layer based on bone names.</w:t>
@@ -225,15 +285,7 @@
     </w:p>
     <w:p>
       <w:r>
-        <w:t xml:space="preserve">Master eye brow reset for eyebrow sliders – they are all parented to a master bone? Or there’s a button that resets their position? Maybe each one </w:t>
-      </w:r>
-      <w:proofErr w:type="gramStart"/>
-      <w:r>
-        <w:t>need</w:t>
-      </w:r>
-      <w:proofErr w:type="gramEnd"/>
-      <w:r>
-        <w:t xml:space="preserve"> a reset button? </w:t>
+        <w:t xml:space="preserve">Master eye brow reset for eyebrow sliders – they are all parented to a master bone? Or there’s a button that resets their position? Maybe each one need a reset button? </w:t>
       </w:r>
     </w:p>
     <w:p>

</xml_diff>